<commit_message>
docs(slides): sync presentation deck, script and Q&A with retrained_v2 metrics
- Synchronize Slide 9 metrics (Negative Recall 45.6%, error reduction -10)
- Add sample review quote box to Slide 12 (Negative 99.0%)
- Clarify error categorization wording on Slide 10
- Enrich defense Q&A on Logistic Regression vs SVM and retrained_v2
- Consolidate to single master PPTX file and sync DOCX/MD scripts
</commit_message>
<xml_diff>
--- a/reports/slides/PRESENTATION_SCRIPT_12_MIN.docx
+++ b/reports/slides/PRESENTATION_SCRIPT_12_MIN.docx
@@ -3,10 +3,14 @@
 <w:document xmlns:wpc="http://schemas.microsoft.com/office/word/2010/wordprocessingCanvas" xmlns:mo="http://schemas.microsoft.com/office/mac/office/2008/main" xmlns:mc="http://schemas.openxmlformats.org/markup-compatibility/2006" xmlns:mv="urn:schemas-microsoft-com:mac:vml" xmlns:o="urn:schemas-microsoft-com:office:office" xmlns:r="http://schemas.openxmlformats.org/officeDocument/2006/relationships" xmlns:m="http://schemas.openxmlformats.org/officeDocument/2006/math" xmlns:v="urn:schemas-microsoft-com:vml" xmlns:wp14="http://schemas.microsoft.com/office/word/2010/wordprocessingDrawing" xmlns:wp="http://schemas.openxmlformats.org/drawingml/2006/wordprocessingDrawing" xmlns:w10="urn:schemas-microsoft-com:office:word" xmlns:w="http://schemas.openxmlformats.org/wordprocessingml/2006/main" xmlns:w14="http://schemas.microsoft.com/office/word/2010/wordml" xmlns:wpg="http://schemas.microsoft.com/office/word/2010/wordprocessingGroup" xmlns:wpi="http://schemas.microsoft.com/office/word/2010/wordprocessingInk" xmlns:wne="http://schemas.microsoft.com/office/word/2006/wordml" xmlns:wps="http://schemas.microsoft.com/office/word/2010/wordprocessingShape" mc:Ignorable="w14 wp14">
   <w:body>
     <w:p>
+      <w:pPr>
+        <w:jc w:val="center"/>
+      </w:pPr>
       <w:r>
         <w:rPr>
+          <w:rFonts w:ascii="Arial" w:hAnsi="Arial"/>
           <w:b/>
-          <w:color w:val="0054A6"/>
+          <w:color w:val="102C57"/>
           <w:sz w:val="40"/>
         </w:rPr>
         <w:t>Kịch bản thuyết trình 12 phút (Bản rút gọn chuẩn năm 1)</w:t>
@@ -15,56 +19,54 @@
     <w:p>
       <w:r>
         <w:rPr>
-          <w:sz w:val="22"/>
+          <w:rFonts w:ascii="Arial" w:hAnsi="Arial"/>
+          <w:sz w:val="21"/>
         </w:rPr>
-        <w:t>**Đề tài:** Phân tích cảm xúc đánh giá công ty ITviec</w:t>
+        <w:t>Đề tài: Phân tích cảm xúc đánh giá công ty ITviec</w:t>
       </w:r>
     </w:p>
     <w:p>
       <w:r>
         <w:rPr>
-          <w:sz w:val="22"/>
+          <w:rFonts w:ascii="Arial" w:hAnsi="Arial"/>
+          <w:sz w:val="21"/>
         </w:rPr>
-        <w:t>**Vị thế người trình bày:** Sinh viên năm nhất UIT học môn Máy Học</w:t>
+        <w:t>Vị thế người trình bày: Sinh viên năm nhất UIT học môn Máy Học</w:t>
       </w:r>
     </w:p>
     <w:p>
       <w:r>
         <w:rPr>
-          <w:sz w:val="22"/>
+          <w:rFonts w:ascii="Arial" w:hAnsi="Arial"/>
+          <w:sz w:val="21"/>
         </w:rPr>
-        <w:t>**Số slide:** 15 slide</w:t>
+        <w:t>Số slide: 15 slide</w:t>
       </w:r>
     </w:p>
     <w:p>
       <w:r>
         <w:rPr>
-          <w:sz w:val="22"/>
+          <w:rFonts w:ascii="Arial" w:hAnsi="Arial"/>
+          <w:sz w:val="21"/>
         </w:rPr>
-        <w:t>**Thời lượng mục tiêu:** 8 phút 30 giây (Slide lý thuyết) + 3 phút 30 giây (Live Demo) $\approx$ **12 phút tổng thể**</w:t>
+        <w:t>Thời lượng mục tiêu: 8 phút 30 giây (Slide lý thuyết) + 3 phút 30 giây (Live Demo) $\approx$ 12 phút tổng thể</w:t>
       </w:r>
     </w:p>
     <w:p>
       <w:r>
         <w:rPr>
-          <w:sz w:val="22"/>
+          <w:rFonts w:ascii="Arial" w:hAnsi="Arial"/>
+          <w:sz w:val="21"/>
         </w:rPr>
-        <w:t>**Phong cách trình bày:** Lễ phép, khiêm tốn, mạch lạc, giải thích bản chất dễ hiểu, tập trung vào điều nhóm đã làm được và nhìn nhận thẳng thắn hạn chế.</w:t>
+        <w:t>Phong cách trình bày: Lễ phép, khiêm tốn, mạch lạc, giải thích bản chất dễ hiểu, tập trung vào điều nhóm đã làm được và nhìn nhận thẳng thắn hạn chế.</w:t>
       </w:r>
     </w:p>
     <w:p>
       <w:r>
         <w:rPr>
-          <w:color w:val="C8C8C8"/>
-        </w:rPr>
-        <w:t>____________________________________________________</w:t>
-      </w:r>
-    </w:p>
-    <w:p>
-      <w:r>
-        <w:rPr>
+          <w:rFonts w:ascii="Arial" w:hAnsi="Arial"/>
           <w:b/>
-          <w:color w:val="141B26"/>
+          <w:color w:val="2155A3"/>
           <w:sz w:val="30"/>
         </w:rPr>
         <w:t>Bảng phân bổ thời gian mục tiêu (Đã tối ưu rút gọn)</w:t>
@@ -73,160 +75,174 @@
     <w:p>
       <w:r>
         <w:rPr>
-          <w:sz w:val="22"/>
+          <w:rFonts w:ascii="Arial" w:hAnsi="Arial"/>
+          <w:sz w:val="21"/>
         </w:rPr>
-        <w:t>| Phần | Slide | Nội dung chính | Thời lượng | Mốc thời gian |</w:t>
+        <w:t>| Phần                   | Slide | Nội dung chính                                          | Thời lượng | Mốc thời gian |</w:t>
       </w:r>
     </w:p>
     <w:p>
       <w:r>
         <w:rPr>
-          <w:sz w:val="22"/>
+          <w:rFonts w:ascii="Arial" w:hAnsi="Arial"/>
+          <w:sz w:val="21"/>
         </w:rPr>
-        <w:t>|:---|---:|:---|---:|---:|</w:t>
+        <w:t>| :---------------------- | ----: | :-------------------------------------------------------- | ------------: | --------------: |</w:t>
       </w:r>
     </w:p>
     <w:p>
       <w:r>
         <w:rPr>
-          <w:sz w:val="22"/>
+          <w:rFonts w:ascii="Arial" w:hAnsi="Arial"/>
+          <w:sz w:val="21"/>
         </w:rPr>
-        <w:t>| **Mở đầu** | 1 | Giới thiệu đề tài &amp; dữ liệu 8.414 review | 25s | 0:25 |</w:t>
+        <w:t>| Mở đầu     |     1 | Giới thiệu đề tài &amp; dữ liệu 8.414 review           |           25s |            0:25 |</w:t>
       </w:r>
     </w:p>
     <w:p>
       <w:r>
         <w:rPr>
-          <w:sz w:val="22"/>
+          <w:rFonts w:ascii="Arial" w:hAnsi="Arial"/>
+          <w:sz w:val="21"/>
         </w:rPr>
-        <w:t>| **Vấn đề** | 2 | Dữ liệu lệch 11:1 &amp; bài toán nhãn yếu | 35s | 1:00 |</w:t>
+        <w:t>| Vấn đề     |     2 | Dữ liệu lệch 11:1 &amp; bài toán nhãn yếu              |           35s |            1:00 |</w:t>
       </w:r>
     </w:p>
     <w:p>
       <w:r>
         <w:rPr>
-          <w:sz w:val="22"/>
+          <w:rFonts w:ascii="Arial" w:hAnsi="Arial"/>
+          <w:sz w:val="21"/>
         </w:rPr>
-        <w:t>| | 3 | Quy trình Pipeline 5 bước thực nghiệm | 35s | 1:35 |</w:t>
+        <w:t>|                         |     3 | Quy trình Pipeline 5 bước thực nghiệm                |           35s |            1:35 |</w:t>
       </w:r>
     </w:p>
     <w:p>
       <w:r>
         <w:rPr>
-          <w:sz w:val="22"/>
+          <w:rFonts w:ascii="Arial" w:hAnsi="Arial"/>
+          <w:sz w:val="21"/>
         </w:rPr>
-        <w:t>| **Kỹ thuật** | 4 | Tiền xử lý 2 tầng &amp; giữ từ cảm xúc then chốt | 35s | 2:10 |</w:t>
+        <w:t>| Kỹ thuật    |     4 | Tiền xử lý 2 tầng &amp; giữ từ cảm xúc then chốt     |           35s |            2:10 |</w:t>
       </w:r>
     </w:p>
     <w:p>
       <w:r>
         <w:rPr>
-          <w:sz w:val="22"/>
+          <w:rFonts w:ascii="Arial" w:hAnsi="Arial"/>
+          <w:sz w:val="21"/>
         </w:rPr>
-        <w:t>| | 5 | Khám phá EDA: Tương quan lương &amp; quản lý | 30s | 2:40 |</w:t>
+        <w:t>|                         |     5 | Khám phá EDA: Tương quan lương &amp; quản lý          |           30s |            2:40 |</w:t>
       </w:r>
     </w:p>
     <w:p>
       <w:r>
         <w:rPr>
-          <w:sz w:val="22"/>
+          <w:rFonts w:ascii="Arial" w:hAnsi="Arial"/>
+          <w:sz w:val="21"/>
         </w:rPr>
-        <w:t>| | 6 | Trích xuất đặc trưng TF-IDF &amp; Bigram | 35s | 3:15 |</w:t>
+        <w:t>|                         |     6 | Trích xuất đặc trưng TF-IDF &amp; Bigram                 |           35s |            3:15 |</w:t>
       </w:r>
     </w:p>
     <w:p>
       <w:r>
         <w:rPr>
-          <w:sz w:val="22"/>
+          <w:rFonts w:ascii="Arial" w:hAnsi="Arial"/>
+          <w:sz w:val="21"/>
         </w:rPr>
-        <w:t>| **Thực nghiệm**| 7 | Thử nghiệm 5 mô hình &amp; SMOTE chống rò rỉ dữ liệu | 35s | 3:50 |</w:t>
+        <w:t>| Thực nghiệm |     7 | Thử nghiệm 5 mô hình &amp; SMOTE chống rò rỉ dữ liệu |           35s |            3:50 |</w:t>
       </w:r>
     </w:p>
     <w:p>
       <w:r>
         <w:rPr>
-          <w:sz w:val="22"/>
+          <w:rFonts w:ascii="Arial" w:hAnsi="Arial"/>
+          <w:sz w:val="21"/>
         </w:rPr>
-        <w:t>| | 8 | Đánh giá Cross-Validation &amp; phép CV riêng | 40s | 4:30 |</w:t>
+        <w:t>|                         |     8 | Đánh giá Cross-Validation &amp; phép CV riêng            |           40s |            4:30 |</w:t>
       </w:r>
     </w:p>
     <w:p>
       <w:r>
         <w:rPr>
-          <w:sz w:val="22"/>
+          <w:rFonts w:ascii="Arial" w:hAnsi="Arial"/>
+          <w:sz w:val="21"/>
         </w:rPr>
-        <w:t>| **Đánh giá** | 9 | Kết quả Final Test &amp; điểm nghẽn lớp Negative | 45s | 5:15 |</w:t>
+        <w:t>| Đánh giá   |     9 | Kết quả Final Test &amp; điểm nghẽn lớp Negative        |           45s |            5:15 |</w:t>
       </w:r>
     </w:p>
     <w:p>
       <w:r>
         <w:rPr>
-          <w:sz w:val="22"/>
+          <w:rFonts w:ascii="Arial" w:hAnsi="Arial"/>
+          <w:sz w:val="21"/>
         </w:rPr>
-        <w:t>| | 10 | Phân loại 15 trường hợp lỗi đại diện | 35s | 5:50 |</w:t>
+        <w:t>|                         |    10 | Phân loại 15 trường hợp lỗi đại diện             |           35s |            5:50 |</w:t>
       </w:r>
     </w:p>
     <w:p>
       <w:r>
         <w:rPr>
-          <w:sz w:val="22"/>
+          <w:rFonts w:ascii="Arial" w:hAnsi="Arial"/>
+          <w:sz w:val="21"/>
         </w:rPr>
-        <w:t>| **Ứng dụng** | 11 | Insight doanh nghiệp: Điểm chạm lương &amp; quản lý | 35s | 6:25 |</w:t>
+        <w:t>| Ứng dụng    |    11 | Insight doanh nghiệp: Điểm chạm lương &amp; quản lý   |           35s |            6:25 |</w:t>
       </w:r>
     </w:p>
     <w:p>
       <w:r>
         <w:rPr>
-          <w:sz w:val="22"/>
+          <w:rFonts w:ascii="Arial" w:hAnsi="Arial"/>
+          <w:sz w:val="21"/>
         </w:rPr>
-        <w:t>| | 12 | Minh họa đặc trưng TF-IDF trên câu thực tế | 35s | 7:00 |</w:t>
+        <w:t>|                         |    12 | Minh họa đặc trưng TF-IDF trên câu thực tế        |           35s |            7:00 |</w:t>
       </w:r>
     </w:p>
     <w:p>
       <w:r>
         <w:rPr>
-          <w:sz w:val="22"/>
+          <w:rFonts w:ascii="Arial" w:hAnsi="Arial"/>
+          <w:sz w:val="21"/>
         </w:rPr>
-        <w:t>| **Tổng kết** | 13 | Đánh giá tổng quan &amp; hạn chế cốt lõi | 35s | 7:35 |</w:t>
+        <w:t>| Tổng kết    |    13 | Đánh giá tổng quan &amp; hạn chế cốt lõi              |           35s |            7:35 |</w:t>
       </w:r>
     </w:p>
     <w:p>
       <w:r>
         <w:rPr>
-          <w:sz w:val="22"/>
+          <w:rFonts w:ascii="Arial" w:hAnsi="Arial"/>
+          <w:sz w:val="21"/>
         </w:rPr>
-        <w:t>| | 14 | Đóng góp &amp; hướng phát triển tương lai | 30s | 8:05 |</w:t>
+        <w:t>|                         |    14 | Đóng góp &amp; hướng phát triển tương lai            |           30s |            8:05 |</w:t>
       </w:r>
     </w:p>
     <w:p>
       <w:r>
         <w:rPr>
-          <w:sz w:val="22"/>
+          <w:rFonts w:ascii="Arial" w:hAnsi="Arial"/>
+          <w:sz w:val="21"/>
         </w:rPr>
-        <w:t>| | 15 | Chuyển giao phần trình bày sang Live Demo | 25s | 8:30 |</w:t>
+        <w:t>|                         |    15 | Chuyển giao phần trình bày sang Live Demo             |           25s |            8:30 |</w:t>
       </w:r>
     </w:p>
     <w:p>
       <w:r>
         <w:rPr>
-          <w:sz w:val="22"/>
+          <w:rFonts w:ascii="Arial" w:hAnsi="Arial"/>
+          <w:sz w:val="21"/>
         </w:rPr>
-        <w:t>| **Phần B** | Demo | Thao tác Streamlit thực tế (Duy Khang) | 3m 30s | **12:00** |</w:t>
+        <w:t>| Phần B       |  Demo | Thao tác Streamlit thực tế (Duy Khang)                 |        3m 30s | 12:00 |</w:t>
       </w:r>
     </w:p>
     <w:p>
+      <w:pPr>
+        <w:jc w:val="center"/>
+      </w:pPr>
       <w:r>
         <w:rPr>
-          <w:color w:val="C8C8C8"/>
-        </w:rPr>
-        <w:t>____________________________________________________</w:t>
-      </w:r>
-    </w:p>
-    <w:p>
-      <w:r>
-        <w:rPr>
+          <w:rFonts w:ascii="Arial" w:hAnsi="Arial"/>
           <w:b/>
-          <w:color w:val="0054A6"/>
+          <w:color w:val="102C57"/>
           <w:sz w:val="40"/>
         </w:rPr>
         <w:t>PHẦN A — THUYẾT TRÌNH SLIDE (8:30)</w:t>
@@ -235,24 +251,18 @@
     <w:p>
       <w:r>
         <w:rPr>
-          <w:sz w:val="22"/>
+          <w:rFonts w:ascii="Arial" w:hAnsi="Arial"/>
+          <w:sz w:val="21"/>
         </w:rPr>
-        <w:t>*(Người trình bày chính: Trần Hoàng Hôn)*</w:t>
+        <w:t>(Người trình bày chính: Trần Hoàng Hôn)</w:t>
       </w:r>
     </w:p>
     <w:p>
       <w:r>
         <w:rPr>
-          <w:color w:val="C8C8C8"/>
-        </w:rPr>
-        <w:t>____________________________________________________</w:t>
-      </w:r>
-    </w:p>
-    <w:p>
-      <w:r>
-        <w:rPr>
+          <w:rFonts w:ascii="Arial" w:hAnsi="Arial"/>
           <w:b/>
-          <w:color w:val="0066CC"/>
+          <w:color w:val="2966C4"/>
           <w:sz w:val="26"/>
         </w:rPr>
         <w:t>Slide 1 — Giới thiệu đề tài</w:t>
@@ -261,9 +271,10 @@
     <w:p>
       <w:r>
         <w:rPr>
-          <w:sz w:val="22"/>
+          <w:rFonts w:ascii="Arial" w:hAnsi="Arial"/>
+          <w:sz w:val="21"/>
         </w:rPr>
-        <w:t>**Thời lượng:** 25 giây *(Mốc: 0:25)*</w:t>
+        <w:t>Thời lượng: 25 giây (Mốc: 0:25)</w:t>
       </w:r>
     </w:p>
     <w:p>
@@ -272,17 +283,19 @@
       </w:pPr>
       <w:r>
         <w:rPr>
+          <w:rFonts w:ascii="Arial" w:hAnsi="Arial"/>
           <w:i/>
           <w:color w:val="1E293B"/>
           <w:sz w:val="22"/>
         </w:rPr>
-        <w:t>"Dạ em xin kính chào Thầy Cáp Phạm Đình Thăng cùng toàn thể các bạn!</w:t>
+        <w:t>"Dạ em xin kính chào Thầy cùng toàn thể các bạn!</w:t>
       </w:r>
     </w:p>
     <w:p>
       <w:r>
         <w:rPr>
-          <w:sz w:val="22"/>
+          <w:rFonts w:ascii="Arial" w:hAnsi="Arial"/>
+          <w:sz w:val="21"/>
         </w:rPr>
         <w:t>&gt;</w:t>
       </w:r>
@@ -293,17 +306,19 @@
       </w:pPr>
       <w:r>
         <w:rPr>
+          <w:rFonts w:ascii="Arial" w:hAnsi="Arial"/>
           <w:i/>
           <w:color w:val="1E293B"/>
           <w:sz w:val="22"/>
         </w:rPr>
-        <w:t>Nhóm chúng em gồm 4 thành viên là sinh viên năm nhất đang theo học môn Máy học. Với đồ án này, nhóm em chọn bài toán: **Phân tích cảm xúc các đánh giá công ty trên nền tảng ITviec**.</w:t>
+        <w:t>Với đồ án này, nhóm em chọn bài toán: Phân tích cảm xúc các đánh giá công ty trên nền tảng ITviec.</w:t>
       </w:r>
     </w:p>
     <w:p>
       <w:r>
         <w:rPr>
-          <w:sz w:val="22"/>
+          <w:rFonts w:ascii="Arial" w:hAnsi="Arial"/>
+          <w:sz w:val="21"/>
         </w:rPr>
         <w:t>&gt;</w:t>
       </w:r>
@@ -314,26 +329,20 @@
       </w:pPr>
       <w:r>
         <w:rPr>
+          <w:rFonts w:ascii="Arial" w:hAnsi="Arial"/>
           <w:i/>
           <w:color w:val="1E293B"/>
           <w:sz w:val="22"/>
         </w:rPr>
-        <w:t>Từ 8.417 dữ liệu thô ban đầu, sau khi loại bỏ trùng lặp, nhóm dùng **8.414 review** để xây dựng mô hình phân loại 3 lớp: Tích cực, Trung tính và Tiêu cực. Hôm nay, nhóm em xin phép báo cáo về quy trình thực nghiệm, kết quả đạt được và những điểm nhóm còn cần cải thiện ạ."</w:t>
+        <w:t>Từ 8.417 dữ liệu thô ban đầu, sau khi loại bỏ trùng lặp, nhóm dùng 8.414 review để xây dựng mô hình phân loại 3 lớp: Tích cực, Trung tính và Tiêu cực. Hôm nay, nhóm xin báo cáo về quy trình thực nghiệm, kết quả đạt được và những điểm nhóm còn cần cải thiện ạ."</w:t>
       </w:r>
     </w:p>
     <w:p>
       <w:r>
         <w:rPr>
-          <w:color w:val="C8C8C8"/>
-        </w:rPr>
-        <w:t>____________________________________________________</w:t>
-      </w:r>
-    </w:p>
-    <w:p>
-      <w:r>
-        <w:rPr>
+          <w:rFonts w:ascii="Arial" w:hAnsi="Arial"/>
           <w:b/>
-          <w:color w:val="0066CC"/>
+          <w:color w:val="2966C4"/>
           <w:sz w:val="26"/>
         </w:rPr>
         <w:t>Slide 2 — Dữ liệu lệch mạnh và bài toán nhãn yếu</w:t>
@@ -342,9 +351,10 @@
     <w:p>
       <w:r>
         <w:rPr>
-          <w:sz w:val="22"/>
+          <w:rFonts w:ascii="Arial" w:hAnsi="Arial"/>
+          <w:sz w:val="21"/>
         </w:rPr>
-        <w:t>**Thời lượng:** 35 giây *(Mốc: 1:00)*</w:t>
+        <w:t>Thời lượng: 35 giây (Mốc: 1:00)</w:t>
       </w:r>
     </w:p>
     <w:p>
@@ -353,6 +363,7 @@
       </w:pPr>
       <w:r>
         <w:rPr>
+          <w:rFonts w:ascii="Arial" w:hAnsi="Arial"/>
           <w:i/>
           <w:color w:val="1E293B"/>
           <w:sz w:val="22"/>
@@ -363,7 +374,8 @@
     <w:p>
       <w:r>
         <w:rPr>
-          <w:sz w:val="22"/>
+          <w:rFonts w:ascii="Arial" w:hAnsi="Arial"/>
+          <w:sz w:val="21"/>
         </w:rPr>
         <w:t>&gt;</w:t>
       </w:r>
@@ -374,17 +386,19 @@
       </w:pPr>
       <w:r>
         <w:rPr>
+          <w:rFonts w:ascii="Arial" w:hAnsi="Arial"/>
           <w:i/>
           <w:color w:val="1E293B"/>
           <w:sz w:val="22"/>
         </w:rPr>
-        <w:t>Thứ nhất là **mất cân bằng lớp nghiêm trọng**. Lớp Tích cực chiếm tới gần 74%, trong khi Tiêu cực chỉ có khoảng 6,8% — tức là cứ 11 lời khen mới có 1 lời chê. Nếu mô hình đoán mò tất cả là Tích cực thì Accuracy vẫn đạt gần 74%. Vì vậy, nhóm em thống nhất dùng **Macro F1** làm thước đo chính, nhằm coi trọng độ chính xác của cả 3 lớp như nhau.</w:t>
+        <w:t>Thứ nhất là mất cân bằng lớp nghiêm trọng. Lớp Tích cực chiếm tới gần 74%, trong khi Tiêu cực chỉ có khoảng 6,8% — tức là cứ 11 lời khen mới có 1 lời chê. Nếu mô hình đoán mò tất cả là Tích cực thì Accuracy vẫn đạt gần 74%. Vì vậy, nhóm em thống nhất dùng Macro F1 làm thước đo chính, nhằm coi trọng độ chính xác của cả 3 lớp như nhau.</w:t>
       </w:r>
     </w:p>
     <w:p>
       <w:r>
         <w:rPr>
-          <w:sz w:val="22"/>
+          <w:rFonts w:ascii="Arial" w:hAnsi="Arial"/>
+          <w:sz w:val="21"/>
         </w:rPr>
         <w:t>&gt;</w:t>
       </w:r>
@@ -395,26 +409,20 @@
       </w:pPr>
       <w:r>
         <w:rPr>
+          <w:rFonts w:ascii="Arial" w:hAnsi="Arial"/>
           <w:i/>
           <w:color w:val="1E293B"/>
           <w:sz w:val="22"/>
         </w:rPr>
-        <w:t>Thử thách thứ hai là **nhãn yếu**: nhãn được quy đổi từ số sao đánh giá, trong khi lời review của người dùng thường vừa khen môi trường nhưng lại chê lương hoặc quản lý."</w:t>
+        <w:t>Thử thách thứ hai là nhãn yếu: nhãn được quy đổi từ số sao đánh giá, trong khi lời review của người dùng thường vừa khen môi trường nhưng lại chê lương hoặc quản lý."</w:t>
       </w:r>
     </w:p>
     <w:p>
       <w:r>
         <w:rPr>
-          <w:color w:val="C8C8C8"/>
-        </w:rPr>
-        <w:t>____________________________________________________</w:t>
-      </w:r>
-    </w:p>
-    <w:p>
-      <w:r>
-        <w:rPr>
+          <w:rFonts w:ascii="Arial" w:hAnsi="Arial"/>
           <w:b/>
-          <w:color w:val="0066CC"/>
+          <w:color w:val="2966C4"/>
           <w:sz w:val="26"/>
         </w:rPr>
         <w:t>Slide 3 — Pipeline tổng thể</w:t>
@@ -423,9 +431,10 @@
     <w:p>
       <w:r>
         <w:rPr>
-          <w:sz w:val="22"/>
+          <w:rFonts w:ascii="Arial" w:hAnsi="Arial"/>
+          <w:sz w:val="21"/>
         </w:rPr>
-        <w:t>**Thời lượng:** 35 giây *(Mốc: 1:35)*</w:t>
+        <w:t>Thời lượng: 35 giây (Mốc: 1:35)</w:t>
       </w:r>
     </w:p>
     <w:p>
@@ -434,17 +443,19 @@
       </w:pPr>
       <w:r>
         <w:rPr>
+          <w:rFonts w:ascii="Arial" w:hAnsi="Arial"/>
           <w:i/>
           <w:color w:val="1E293B"/>
           <w:sz w:val="22"/>
         </w:rPr>
-        <w:t>"Quy trình thực nghiệm của nhóm em đi qua 5 bước rõ ràng:</w:t>
+        <w:t>"Quy trình thực nghiệm của nhóm em đi qua 5 bước:</w:t>
       </w:r>
     </w:p>
     <w:p>
       <w:r>
         <w:rPr>
-          <w:sz w:val="22"/>
+          <w:rFonts w:ascii="Arial" w:hAnsi="Arial"/>
+          <w:sz w:val="21"/>
         </w:rPr>
         <w:t>&gt;</w:t>
       </w:r>
@@ -455,6 +466,7 @@
       </w:pPr>
       <w:r>
         <w:rPr>
+          <w:rFonts w:ascii="Arial" w:hAnsi="Arial"/>
           <w:i/>
           <w:color w:val="1E293B"/>
           <w:sz w:val="22"/>
@@ -465,7 +477,8 @@
     <w:p>
       <w:r>
         <w:rPr>
-          <w:sz w:val="22"/>
+          <w:rFonts w:ascii="Arial" w:hAnsi="Arial"/>
+          <w:sz w:val="21"/>
         </w:rPr>
         <w:t>&gt;</w:t>
       </w:r>
@@ -476,17 +489,19 @@
       </w:pPr>
       <w:r>
         <w:rPr>
+          <w:rFonts w:ascii="Arial" w:hAnsi="Arial"/>
           <w:i/>
           <w:color w:val="1E293B"/>
           <w:sz w:val="22"/>
         </w:rPr>
-        <w:t>Tiếp theo, nhóm thử nghiệm 5 mô hình trên tập Development qua phương pháp 5-Fold Cross Validation.</w:t>
+        <w:t>Tiếp theo, nhóm thử nghiệm 5 mô hình trên tập Development qua phương pháp 5-Fold Cross Validation (Phai-Phô Cờ-rót Va-li-đây-sần - Kiểm chứng chéo 5 phần).</w:t>
       </w:r>
     </w:p>
     <w:p>
       <w:r>
         <w:rPr>
-          <w:sz w:val="22"/>
+          <w:rFonts w:ascii="Arial" w:hAnsi="Arial"/>
+          <w:sz w:val="21"/>
         </w:rPr>
         <w:t>&gt;</w:t>
       </w:r>
@@ -497,26 +512,20 @@
       </w:pPr>
       <w:r>
         <w:rPr>
+          <w:rFonts w:ascii="Arial" w:hAnsi="Arial"/>
           <w:i/>
           <w:color w:val="1E293B"/>
           <w:sz w:val="22"/>
         </w:rPr>
-        <w:t>Đặc biệt, khi kiểm tra các câu ngắn, nhóm phát hiện bộ tiền xử lý cũ vô tình xóa mất một số từ mang cảm xúc. Nhóm đã kịp thời tinh chỉnh lại và huấn luyện phiên bản `retrained_v2` với mô hình Logistic Regression kết hợp SMOTE, đạt **Macro F1 0,5764 trên cùng tập Final Test cũ** để làm đối chứng minh bạch ạ."</w:t>
+        <w:t>Đặc biệt, khi thử nghiệm câu ngắn, nhóm phát hiện bộ tiền xử lý cũ xóa mất từ cảm xúc. Nhóm đã tinh chỉnh lại pipeline và huấn luyện  phiên bản cải tiến tiền xử lý , đạt Macro F1 0,5764 trên tập Test cũ để làm đối chứng minh bạch ạ."</w:t>
       </w:r>
     </w:p>
     <w:p>
       <w:r>
         <w:rPr>
-          <w:color w:val="C8C8C8"/>
-        </w:rPr>
-        <w:t>____________________________________________________</w:t>
-      </w:r>
-    </w:p>
-    <w:p>
-      <w:r>
-        <w:rPr>
+          <w:rFonts w:ascii="Arial" w:hAnsi="Arial"/>
           <w:b/>
-          <w:color w:val="0066CC"/>
+          <w:color w:val="2966C4"/>
           <w:sz w:val="26"/>
         </w:rPr>
         <w:t>Slide 4 — Tiền xử lý tiếng Việt</w:t>
@@ -525,9 +534,10 @@
     <w:p>
       <w:r>
         <w:rPr>
-          <w:sz w:val="22"/>
+          <w:rFonts w:ascii="Arial" w:hAnsi="Arial"/>
+          <w:sz w:val="21"/>
         </w:rPr>
-        <w:t>**Thời lượng:** 35 giây *(Mốc: 2:10)*</w:t>
+        <w:t>Thời lượng: 35 giây (Mốc: 2:10)</w:t>
       </w:r>
     </w:p>
     <w:p>
@@ -536,6 +546,7 @@
       </w:pPr>
       <w:r>
         <w:rPr>
+          <w:rFonts w:ascii="Arial" w:hAnsi="Arial"/>
           <w:i/>
           <w:color w:val="1E293B"/>
           <w:sz w:val="22"/>
@@ -546,7 +557,8 @@
     <w:p>
       <w:r>
         <w:rPr>
-          <w:sz w:val="22"/>
+          <w:rFonts w:ascii="Arial" w:hAnsi="Arial"/>
+          <w:sz w:val="21"/>
         </w:rPr>
         <w:t>&gt;</w:t>
       </w:r>
@@ -557,11 +569,12 @@
       </w:pPr>
       <w:r>
         <w:rPr>
+          <w:rFonts w:ascii="Arial" w:hAnsi="Arial"/>
           <w:i/>
           <w:color w:val="1E293B"/>
           <w:sz w:val="22"/>
         </w:rPr>
-        <w:t>- **Tầng 1:** Chuẩn hóa Unicode, đưa về chữ thường, xử lý URL, email, teencode và thuật ngữ IT.</w:t>
+        <w:t>- Tầng 1: Chuẩn hóa Unicode, đưa về chữ thường, xử lý URL, email, teencode và thuật ngữ IT.</w:t>
       </w:r>
     </w:p>
     <w:p>
@@ -570,17 +583,19 @@
       </w:pPr>
       <w:r>
         <w:rPr>
+          <w:rFonts w:ascii="Arial" w:hAnsi="Arial"/>
           <w:i/>
           <w:color w:val="1E293B"/>
           <w:sz w:val="22"/>
         </w:rPr>
-        <w:t>- **Tầng 2:** Tách từ tiếng Việt và lọc từ dừng.</w:t>
+        <w:t>- Tầng 2: Tách từ tiếng Việt và lọc từ dừng.</w:t>
       </w:r>
     </w:p>
     <w:p>
       <w:r>
         <w:rPr>
-          <w:sz w:val="22"/>
+          <w:rFonts w:ascii="Arial" w:hAnsi="Arial"/>
+          <w:sz w:val="21"/>
         </w:rPr>
         <w:t>&gt;</w:t>
       </w:r>
@@ -591,26 +606,20 @@
       </w:pPr>
       <w:r>
         <w:rPr>
+          <w:rFonts w:ascii="Arial" w:hAnsi="Arial"/>
           <w:i/>
           <w:color w:val="1E293B"/>
           <w:sz w:val="22"/>
         </w:rPr>
-        <w:t>Điểm then chốt mà nhóm em rút ra là: **tuyệt đối không xóa các từ phủ định** như *'không', 'chưa'* và các từ chỉ mức độ như *'thấp', 'thiếu'*. Như ví dụ bên phải: cụm *'lương thấp'*, *'thiếu minh_bạch'* hay *'không lương'* đều được giữ nguyên vẹn để mô hình không hiểu ngược nghĩa của câu."</w:t>
+        <w:t>Điểm then chốt mà nhóm em rút ra là: tuyệt đối không xóa các từ phủ định như 'không', 'chưa' và các từ chỉ mức độ như 'thấp', 'thiếu'. Như ví dụ bên phải: cụm 'lương thấp', 'thiếu minh_bạch' hay 'không lương' đều được giữ nguyên vẹn để mô hình không hiểu ngược nghĩa của câu."</w:t>
       </w:r>
     </w:p>
     <w:p>
       <w:r>
         <w:rPr>
-          <w:color w:val="C8C8C8"/>
-        </w:rPr>
-        <w:t>____________________________________________________</w:t>
-      </w:r>
-    </w:p>
-    <w:p>
-      <w:r>
-        <w:rPr>
+          <w:rFonts w:ascii="Arial" w:hAnsi="Arial"/>
           <w:b/>
-          <w:color w:val="0066CC"/>
+          <w:color w:val="2966C4"/>
           <w:sz w:val="26"/>
         </w:rPr>
         <w:t>Slide 5 — Khám phá dữ liệu (EDA)</w:t>
@@ -619,9 +628,10 @@
     <w:p>
       <w:r>
         <w:rPr>
-          <w:sz w:val="22"/>
+          <w:rFonts w:ascii="Arial" w:hAnsi="Arial"/>
+          <w:sz w:val="21"/>
         </w:rPr>
-        <w:t>**Thời lượng:** 30 giây *(Mốc: 2:40)*</w:t>
+        <w:t>Thời lượng: 30 giây (Mốc: 2:40)</w:t>
       </w:r>
     </w:p>
     <w:p>
@@ -630,6 +640,7 @@
       </w:pPr>
       <w:r>
         <w:rPr>
+          <w:rFonts w:ascii="Arial" w:hAnsi="Arial"/>
           <w:i/>
           <w:color w:val="1E293B"/>
           <w:sz w:val="22"/>
@@ -640,7 +651,8 @@
     <w:p>
       <w:r>
         <w:rPr>
-          <w:sz w:val="22"/>
+          <w:rFonts w:ascii="Arial" w:hAnsi="Arial"/>
+          <w:sz w:val="21"/>
         </w:rPr>
         <w:t>&gt;</w:t>
       </w:r>
@@ -651,17 +663,19 @@
       </w:pPr>
       <w:r>
         <w:rPr>
+          <w:rFonts w:ascii="Arial" w:hAnsi="Arial"/>
           <w:i/>
           <w:color w:val="1E293B"/>
           <w:sz w:val="22"/>
         </w:rPr>
-        <w:t>Điểm đánh giá về **Lương** và **Quản lý** có tương quan thuận cao nhất với mức độ hài lòng chung của nhân viên, đều đạt trên 0,73. Trong khi điểm Văn phòng có mức tương quan thấp hơn nhiều, chỉ khoảng 0,54.</w:t>
+        <w:t>Điểm đánh giá về Lương và Quản lý có tương quan thuận cao nhất với mức độ hài lòng chung của nhân viên, đều đạt trên 0,73. Trong khi điểm Văn phòng có mức tương quan thấp hơn nhiều, chỉ khoảng 0,54.</w:t>
       </w:r>
     </w:p>
     <w:p>
       <w:r>
         <w:rPr>
-          <w:sz w:val="22"/>
+          <w:rFonts w:ascii="Arial" w:hAnsi="Arial"/>
+          <w:sz w:val="21"/>
         </w:rPr>
         <w:t>&gt;</w:t>
       </w:r>
@@ -672,26 +686,20 @@
       </w:pPr>
       <w:r>
         <w:rPr>
+          <w:rFonts w:ascii="Arial" w:hAnsi="Arial"/>
           <w:i/>
           <w:color w:val="1E293B"/>
           <w:sz w:val="22"/>
         </w:rPr>
-        <w:t>Tuy nhiên, tương quan không đồng nghĩa với quan hệ nhân quả. Khi người dùng nhập một review mới ngoài thực tế, họ thường không chấm các điểm thành phần này. Vì vậy, pipeline phân loại của nhóm chỉ dựa hoàn toàn trên văn bản review ạ."</w:t>
+        <w:t>Tuy nhiên, tương quan không đồng nghĩa với quan hệ nhân quả. Khi người dùng nhập một review mới ngoài thực tế, họ thường không chấm các điểm thành phần này. Vì vậy, pipeline phân loại của nhóm chỉ dựa hoàn toàn trên văn bản review."</w:t>
       </w:r>
     </w:p>
     <w:p>
       <w:r>
         <w:rPr>
-          <w:color w:val="C8C8C8"/>
-        </w:rPr>
-        <w:t>____________________________________________________</w:t>
-      </w:r>
-    </w:p>
-    <w:p>
-      <w:r>
-        <w:rPr>
+          <w:rFonts w:ascii="Arial" w:hAnsi="Arial"/>
           <w:b/>
-          <w:color w:val="0066CC"/>
+          <w:color w:val="2966C4"/>
           <w:sz w:val="26"/>
         </w:rPr>
         <w:t>Slide 6 — Trích xuất đặc trưng TF-IDF</w:t>
@@ -700,9 +708,10 @@
     <w:p>
       <w:r>
         <w:rPr>
-          <w:sz w:val="22"/>
+          <w:rFonts w:ascii="Arial" w:hAnsi="Arial"/>
+          <w:sz w:val="21"/>
         </w:rPr>
-        <w:t>**Thời lượng:** 35 giây *(Mốc: 3:15)*</w:t>
+        <w:t>Thời lượng: 35 giây (Mốc: 3:15)</w:t>
       </w:r>
     </w:p>
     <w:p>
@@ -711,6 +720,7 @@
       </w:pPr>
       <w:r>
         <w:rPr>
+          <w:rFonts w:ascii="Arial" w:hAnsi="Arial"/>
           <w:i/>
           <w:color w:val="1E293B"/>
           <w:sz w:val="22"/>
@@ -721,7 +731,8 @@
     <w:p>
       <w:r>
         <w:rPr>
-          <w:sz w:val="22"/>
+          <w:rFonts w:ascii="Arial" w:hAnsi="Arial"/>
+          <w:sz w:val="21"/>
         </w:rPr>
         <w:t>&gt;</w:t>
       </w:r>
@@ -732,6 +743,7 @@
       </w:pPr>
       <w:r>
         <w:rPr>
+          <w:rFonts w:ascii="Arial" w:hAnsi="Arial"/>
           <w:i/>
           <w:color w:val="1E293B"/>
           <w:sz w:val="22"/>
@@ -745,17 +757,19 @@
       </w:pPr>
       <w:r>
         <w:rPr>
+          <w:rFonts w:ascii="Arial" w:hAnsi="Arial"/>
           <w:i/>
           <w:color w:val="1E293B"/>
           <w:sz w:val="22"/>
         </w:rPr>
-        <w:t>- Khi bổ sung thêm cụm 2 từ liền kề (Bigram), kết quả tăng rõ rệt lên **57,22%**.</w:t>
+        <w:t>- Khi bổ sung thêm cụm 2 từ liền kề (Bigram), kết quả tăng rõ rệt lên 57,22%.</w:t>
       </w:r>
     </w:p>
     <w:p>
       <w:r>
         <w:rPr>
-          <w:sz w:val="22"/>
+          <w:rFonts w:ascii="Arial" w:hAnsi="Arial"/>
+          <w:sz w:val="21"/>
         </w:rPr>
         <w:t>&gt;</w:t>
       </w:r>
@@ -766,26 +780,20 @@
       </w:pPr>
       <w:r>
         <w:rPr>
+          <w:rFonts w:ascii="Arial" w:hAnsi="Arial"/>
           <w:i/>
           <w:color w:val="1E293B"/>
           <w:sz w:val="22"/>
         </w:rPr>
-        <w:t>Bigram giúp mô hình nắm bắt được các ngữ cảnh then chốt như *'không lương'* hay *'thiếu minh bạch'* thay vì nhìn từng từ rời rạc. Cấu hình cuối cùng được nhóm chọn có 5.000 đặc trưng, loại bỏ các từ chỉ xuất hiện đúng một lần trong toàn bộ tập dữ liệu."</w:t>
+        <w:t>Bigram giúp mô hình nắm bắt được các ngữ cảnh then chốt như 'không lương' hay 'thiếu minh bạch' thay vì nhìn từng từ rời rạc. Cấu hình cuối cùng được nhóm chọn có 5.000 đặc trưng, loại bỏ các từ chỉ xuất hiện đúng một lần trong toàn bộ tập dữ liệu."</w:t>
       </w:r>
     </w:p>
     <w:p>
       <w:r>
         <w:rPr>
-          <w:color w:val="C8C8C8"/>
-        </w:rPr>
-        <w:t>____________________________________________________</w:t>
-      </w:r>
-    </w:p>
-    <w:p>
-      <w:r>
-        <w:rPr>
+          <w:rFonts w:ascii="Arial" w:hAnsi="Arial"/>
           <w:b/>
-          <w:color w:val="0066CC"/>
+          <w:color w:val="2966C4"/>
           <w:sz w:val="26"/>
         </w:rPr>
         <w:t>Slide 7 — Thử nghiệm mô hình &amp; SMOTE</w:t>
@@ -794,9 +802,10 @@
     <w:p>
       <w:r>
         <w:rPr>
-          <w:sz w:val="22"/>
+          <w:rFonts w:ascii="Arial" w:hAnsi="Arial"/>
+          <w:sz w:val="21"/>
         </w:rPr>
-        <w:t>**Thời lượng:** 35 giây *(Mốc: 3:50)*</w:t>
+        <w:t>Thời lượng: 35 giây (Mốc: 3:50)</w:t>
       </w:r>
     </w:p>
     <w:p>
@@ -805,6 +814,7 @@
       </w:pPr>
       <w:r>
         <w:rPr>
+          <w:rFonts w:ascii="Arial" w:hAnsi="Arial"/>
           <w:i/>
           <w:color w:val="1E293B"/>
           <w:sz w:val="22"/>
@@ -815,7 +825,8 @@
     <w:p>
       <w:r>
         <w:rPr>
-          <w:sz w:val="22"/>
+          <w:rFonts w:ascii="Arial" w:hAnsi="Arial"/>
+          <w:sz w:val="21"/>
         </w:rPr>
         <w:t>&gt;</w:t>
       </w:r>
@@ -826,6 +837,7 @@
       </w:pPr>
       <w:r>
         <w:rPr>
+          <w:rFonts w:ascii="Arial" w:hAnsi="Arial"/>
           <w:i/>
           <w:color w:val="1E293B"/>
           <w:sz w:val="22"/>
@@ -836,7 +848,8 @@
     <w:p>
       <w:r>
         <w:rPr>
-          <w:sz w:val="22"/>
+          <w:rFonts w:ascii="Arial" w:hAnsi="Arial"/>
+          <w:sz w:val="21"/>
         </w:rPr>
         <w:t>&gt;</w:t>
       </w:r>
@@ -847,26 +860,20 @@
       </w:pPr>
       <w:r>
         <w:rPr>
+          <w:rFonts w:ascii="Arial" w:hAnsi="Arial"/>
           <w:i/>
           <w:color w:val="1E293B"/>
           <w:sz w:val="22"/>
         </w:rPr>
-        <w:t>Một chi tiết kỹ thuật quan trọng mà nhóm em tuân thủ nghiêm ngặt là: **chỉ áp dụng SMOTE bên trong tập huấn luyện của từng fold**. Nếu sinh mẫu trước khi chia fold, dữ liệu kiểm tra sẽ bị rò rỉ vào tập train, dẫn đến điểm ảo — đây là lỗi Data Leakage mà nhóm đã chủ động phòng tránh."</w:t>
+        <w:t>Một chi tiết kỹ thuật quan trọng mà nhóm em tuân thủ nghiêm ngặt là: chỉ áp dụng SMOTE bên trong tập huấn luyện của từng fold. Nếu sinh mẫu trước khi chia fold, dữ liệu kiểm tra sẽ bị rò rỉ vào tập train, dẫn đến điểm ảo — đây là lỗi Data Leakage mà nhóm đã chủ động phòng tránh."</w:t>
       </w:r>
     </w:p>
     <w:p>
       <w:r>
         <w:rPr>
-          <w:color w:val="C8C8C8"/>
-        </w:rPr>
-        <w:t>____________________________________________________</w:t>
-      </w:r>
-    </w:p>
-    <w:p>
-      <w:r>
-        <w:rPr>
+          <w:rFonts w:ascii="Arial" w:hAnsi="Arial"/>
           <w:b/>
-          <w:color w:val="0066CC"/>
+          <w:color w:val="2966C4"/>
           <w:sz w:val="26"/>
         </w:rPr>
         <w:t>Slide 8 — Kết quả Cross Validation</w:t>
@@ -875,9 +882,10 @@
     <w:p>
       <w:r>
         <w:rPr>
-          <w:sz w:val="22"/>
+          <w:rFonts w:ascii="Arial" w:hAnsi="Arial"/>
+          <w:sz w:val="21"/>
         </w:rPr>
-        <w:t>**Thời lượng:** 40 giây *(Mốc: 4:30)*</w:t>
+        <w:t>Thời lượng: 40 giây (Mốc: 4:30)</w:t>
       </w:r>
     </w:p>
     <w:p>
@@ -886,17 +894,19 @@
       </w:pPr>
       <w:r>
         <w:rPr>
+          <w:rFonts w:ascii="Arial" w:hAnsi="Arial"/>
           <w:i/>
           <w:color w:val="1E293B"/>
           <w:sz w:val="22"/>
         </w:rPr>
-        <w:t>"Ở lần thử nghiệm ban đầu, Logistic Regression và Linear SVM bám đuổi rất sát nhau với Macro F1 lần lượt là 0,5727 và 0,5724 — chênh lệch chỉ 0,0003. Nhóm chọn Logistic Regression vì mô hình này trả về xác suất mềm rất trực quan cho ứng dụng demo.</w:t>
+        <w:t>"Ở lần thử nghiệm ban đầu, Logistic Regression và Linear SVM bám đuổi rất sát nhau với Macro F1 lần lượt là 0,5727 và 0,5724 — chênh lệch rất nhỏ. Logistic Regression được chọn làm mô hình triển khai vì đạt  hiệu năng cân bằng nhất trên thực nghiệm , tốc độ suy luận nhanh và phân phối xác suất mềm ổn định, rất phù hợp cho ứng dụng thực tế.</w:t>
       </w:r>
     </w:p>
     <w:p>
       <w:r>
         <w:rPr>
-          <w:sz w:val="22"/>
+          <w:rFonts w:ascii="Arial" w:hAnsi="Arial"/>
+          <w:sz w:val="21"/>
         </w:rPr>
         <w:t>&gt;</w:t>
       </w:r>
@@ -907,17 +917,19 @@
       </w:pPr>
       <w:r>
         <w:rPr>
+          <w:rFonts w:ascii="Arial" w:hAnsi="Arial"/>
           <w:i/>
           <w:color w:val="1E293B"/>
           <w:sz w:val="22"/>
         </w:rPr>
-        <w:t>Sau khi sửa tiền xử lý, nhóm chạy một phép 5-Fold CV độc lập trên tập Development để kiểm chứng lại. Kết quả cho thấy Macro F1 tăng từ 0,5708 lên **0,5815**.</w:t>
+        <w:t>Sau khi tinh chỉnh bộ tiền xử lý, nhóm tiến hành chạy lại Phai-phô Si-Vi độc lập trên tập train. Kết quả cho thấy chỉ số Macro F1 cải thiện rõ rệt, tăng từ 0,57 lên 0,5815.</w:t>
       </w:r>
     </w:p>
     <w:p>
       <w:r>
         <w:rPr>
-          <w:sz w:val="22"/>
+          <w:rFonts w:ascii="Arial" w:hAnsi="Arial"/>
+          <w:sz w:val="21"/>
         </w:rPr>
         <w:t>&gt;</w:t>
       </w:r>
@@ -928,26 +940,20 @@
       </w:pPr>
       <w:r>
         <w:rPr>
+          <w:rFonts w:ascii="Arial" w:hAnsi="Arial"/>
           <w:i/>
           <w:color w:val="1E293B"/>
           <w:sz w:val="22"/>
         </w:rPr>
-        <w:t>Nhóm em xin nhấn mạnh: đây là phép CV riêng rẽ để chọn ra bản sửa tốt nhất, chứ nhóm không so sánh trực tiếp một cách tùy tiện với các bảng điểm cũ ạ."</w:t>
+        <w:t>Nhóm xin lưu ý: đây là phép kiểm định chéo riêng biệt nhằm chọn ra phiên bản tiền xử lý tối ưu nhất, chứ nhóm không so sánh khập khiễng với các kết quả cũ khi không gian đặc trưng đã thay đổi"</w:t>
       </w:r>
     </w:p>
     <w:p>
       <w:r>
         <w:rPr>
-          <w:color w:val="C8C8C8"/>
-        </w:rPr>
-        <w:t>____________________________________________________</w:t>
-      </w:r>
-    </w:p>
-    <w:p>
-      <w:r>
-        <w:rPr>
+          <w:rFonts w:ascii="Arial" w:hAnsi="Arial"/>
           <w:b/>
-          <w:color w:val="0066CC"/>
+          <w:color w:val="2966C4"/>
           <w:sz w:val="26"/>
         </w:rPr>
         <w:t>Slide 9 — Kết quả Final Test</w:t>
@@ -956,9 +962,10 @@
     <w:p>
       <w:r>
         <w:rPr>
-          <w:sz w:val="22"/>
+          <w:rFonts w:ascii="Arial" w:hAnsi="Arial"/>
+          <w:sz w:val="21"/>
         </w:rPr>
-        <w:t>**Thời lượng:** 45 giây *(Mốc: 5:15)*</w:t>
+        <w:t>Thời lượng: 45 giây (Mốc: 5:15)</w:t>
       </w:r>
     </w:p>
     <w:p>
@@ -967,6 +974,7 @@
       </w:pPr>
       <w:r>
         <w:rPr>
+          <w:rFonts w:ascii="Arial" w:hAnsi="Arial"/>
           <w:i/>
           <w:color w:val="1E293B"/>
           <w:sz w:val="22"/>
@@ -977,7 +985,8 @@
     <w:p>
       <w:r>
         <w:rPr>
-          <w:sz w:val="22"/>
+          <w:rFonts w:ascii="Arial" w:hAnsi="Arial"/>
+          <w:sz w:val="21"/>
         </w:rPr>
         <w:t>&gt;</w:t>
       </w:r>
@@ -988,17 +997,19 @@
       </w:pPr>
       <w:r>
         <w:rPr>
+          <w:rFonts w:ascii="Arial" w:hAnsi="Arial"/>
           <w:i/>
           <w:color w:val="1E293B"/>
           <w:sz w:val="22"/>
         </w:rPr>
-        <w:t>Tuy nhiên, nhìn sâu vào ma trận nhầm lẫn ở lớp Tiêu cực: trong 114 review thực sự tiêu cực, mô hình đoán đúng 52 review, nhưng bỏ sót 62 review sang lớp Trung tính và Tích cực. Độ nhạy (Recall) của lớp này chỉ đạt **45,6%** và F1 đạt 0,3910.</w:t>
+        <w:t>Tuy nhiên, nhìn sâu vào ma trận nhầm lẫn ở lớp Tiêu cực: trong 114 review thực sự tiêu cực, mô hình đoán đúng 52 review, nhưng bỏ sót 62 review sang lớp Trung tính và Tích cực. Độ nhạy (Recall) của lớp này chỉ đạt 45,6% và F1 đạt 0,3910.</w:t>
       </w:r>
     </w:p>
     <w:p>
       <w:r>
         <w:rPr>
-          <w:sz w:val="22"/>
+          <w:rFonts w:ascii="Arial" w:hAnsi="Arial"/>
+          <w:sz w:val="21"/>
         </w:rPr>
         <w:t>&gt;</w:t>
       </w:r>
@@ -1009,6 +1020,7 @@
       </w:pPr>
       <w:r>
         <w:rPr>
+          <w:rFonts w:ascii="Arial" w:hAnsi="Arial"/>
           <w:i/>
           <w:color w:val="1E293B"/>
           <w:sz w:val="22"/>
@@ -1019,16 +1031,9 @@
     <w:p>
       <w:r>
         <w:rPr>
-          <w:color w:val="C8C8C8"/>
-        </w:rPr>
-        <w:t>____________________________________________________</w:t>
-      </w:r>
-    </w:p>
-    <w:p>
-      <w:r>
-        <w:rPr>
+          <w:rFonts w:ascii="Arial" w:hAnsi="Arial"/>
           <w:b/>
-          <w:color w:val="0066CC"/>
+          <w:color w:val="2966C4"/>
           <w:sz w:val="26"/>
         </w:rPr>
         <w:t>Slide 10 — Phân loại 15 trường hợp lỗi</w:t>
@@ -1037,9 +1042,10 @@
     <w:p>
       <w:r>
         <w:rPr>
-          <w:sz w:val="22"/>
+          <w:rFonts w:ascii="Arial" w:hAnsi="Arial"/>
+          <w:sz w:val="21"/>
         </w:rPr>
-        <w:t>**Thời lượng:** 35 giây *(Mốc: 5:50)*</w:t>
+        <w:t>Thời lượng: 35 giây (Mốc: 5:50)</w:t>
       </w:r>
     </w:p>
     <w:p>
@@ -1048,17 +1054,19 @@
       </w:pPr>
       <w:r>
         <w:rPr>
+          <w:rFonts w:ascii="Arial" w:hAnsi="Arial"/>
           <w:i/>
           <w:color w:val="1E293B"/>
           <w:sz w:val="22"/>
         </w:rPr>
-        <w:t>"Để hiểu tại sao mô hình còn đoán sai 432 mẫu, hệ thống của nhóm đã tự động gom nhóm phân tích 15 lỗi minh họa:</w:t>
+        <w:t>"Để phân tích 432 ca dự đoán sai, nhóm đã sử dụng các dấu hiệu văn bản để lọc ra  15 trường hợp lỗi đại diện , tập trung vào 3 nhóm nguyên nhân chính sau đây:</w:t>
       </w:r>
     </w:p>
     <w:p>
       <w:r>
         <w:rPr>
-          <w:sz w:val="22"/>
+          <w:rFonts w:ascii="Arial" w:hAnsi="Arial"/>
+          <w:sz w:val="21"/>
         </w:rPr>
         <w:t>&gt;</w:t>
       </w:r>
@@ -1069,11 +1077,12 @@
       </w:pPr>
       <w:r>
         <w:rPr>
+          <w:rFonts w:ascii="Arial" w:hAnsi="Arial"/>
           <w:i/>
           <w:color w:val="1E293B"/>
           <w:sz w:val="22"/>
         </w:rPr>
-        <w:t>- Có 7 câu chứa **nhiều vế đối lập**: người viết vừa khen môi trường nhưng lại vừa phàn nàn về lương.</w:t>
+        <w:t>- Có 7 câu chứa nhiều vế đối lập: người viết vừa khen môi trường nhưng lại vừa phàn nàn về lương.</w:t>
       </w:r>
     </w:p>
     <w:p>
@@ -1082,11 +1091,12 @@
       </w:pPr>
       <w:r>
         <w:rPr>
+          <w:rFonts w:ascii="Arial" w:hAnsi="Arial"/>
           <w:i/>
           <w:color w:val="1E293B"/>
           <w:sz w:val="22"/>
         </w:rPr>
-        <w:t>- Có 6 câu có **cấu trúc phủ định phức tạp** hoặc dùng từ ngữ mỉa mai ở xa nhau mà TF-IDF chưa bắt kịp.</w:t>
+        <w:t>- Có 6 câu có cấu trúc phủ định phức tạp hoặc dùng từ ngữ mỉa mai ở xa nhau mà TF-IDF chưa bắt kịp.</w:t>
       </w:r>
     </w:p>
     <w:p>
@@ -1095,6 +1105,7 @@
       </w:pPr>
       <w:r>
         <w:rPr>
+          <w:rFonts w:ascii="Arial" w:hAnsi="Arial"/>
           <w:i/>
           <w:color w:val="1E293B"/>
           <w:sz w:val="22"/>
@@ -1105,7 +1116,8 @@
     <w:p>
       <w:r>
         <w:rPr>
-          <w:sz w:val="22"/>
+          <w:rFonts w:ascii="Arial" w:hAnsi="Arial"/>
+          <w:sz w:val="21"/>
         </w:rPr>
         <w:t>&gt;</w:t>
       </w:r>
@@ -1116,6 +1128,7 @@
       </w:pPr>
       <w:r>
         <w:rPr>
+          <w:rFonts w:ascii="Arial" w:hAnsi="Arial"/>
           <w:i/>
           <w:color w:val="1E293B"/>
           <w:sz w:val="22"/>
@@ -1126,16 +1139,9 @@
     <w:p>
       <w:r>
         <w:rPr>
-          <w:color w:val="C8C8C8"/>
-        </w:rPr>
-        <w:t>____________________________________________________</w:t>
-      </w:r>
-    </w:p>
-    <w:p>
-      <w:r>
-        <w:rPr>
+          <w:rFonts w:ascii="Arial" w:hAnsi="Arial"/>
           <w:b/>
-          <w:color w:val="0066CC"/>
+          <w:color w:val="2966C4"/>
           <w:sz w:val="26"/>
         </w:rPr>
         <w:t>Slide 11 — Khám phá Insight doanh nghiệp</w:t>
@@ -1144,9 +1150,10 @@
     <w:p>
       <w:r>
         <w:rPr>
-          <w:sz w:val="22"/>
+          <w:rFonts w:ascii="Arial" w:hAnsi="Arial"/>
+          <w:sz w:val="21"/>
         </w:rPr>
-        <w:t>**Thời lượng:** 35 giây *(Mốc: 6:25)*</w:t>
+        <w:t>Thời lượng: 35 giây (Mốc: 6:25)</w:t>
       </w:r>
     </w:p>
     <w:p>
@@ -1155,6 +1162,7 @@
       </w:pPr>
       <w:r>
         <w:rPr>
+          <w:rFonts w:ascii="Arial" w:hAnsi="Arial"/>
           <w:i/>
           <w:color w:val="1E293B"/>
           <w:sz w:val="22"/>
@@ -1165,7 +1173,8 @@
     <w:p>
       <w:r>
         <w:rPr>
-          <w:sz w:val="22"/>
+          <w:rFonts w:ascii="Arial" w:hAnsi="Arial"/>
+          <w:sz w:val="21"/>
         </w:rPr>
         <w:t>&gt;</w:t>
       </w:r>
@@ -1176,17 +1185,19 @@
       </w:pPr>
       <w:r>
         <w:rPr>
+          <w:rFonts w:ascii="Arial" w:hAnsi="Arial"/>
           <w:i/>
           <w:color w:val="1E293B"/>
           <w:sz w:val="22"/>
         </w:rPr>
-        <w:t>Điểm chung thú vị là ở 4 trên 5 công ty (FPT Software, NashTech, Bosch, KMS), khía cạnh **Lương &amp; đãi ngộ** luôn là điểm thấp nhất. Riêng VNG, khía cạnh có điểm thấp nhất lại rơi vào sự quan tâm của cấp quản lý.</w:t>
+        <w:t>Điểm chung thú vị là ở 4 trên 5 công ty (FPT Software, NashTech, Bosch, KMS), khía cạnh Lương &amp; đãi ngộ luôn là điểm thấp nhất. Riêng VNG, khía cạnh có điểm thấp nhất lại rơi vào sự quan tâm của cấp quản lý.</w:t>
       </w:r>
     </w:p>
     <w:p>
       <w:r>
         <w:rPr>
-          <w:sz w:val="22"/>
+          <w:rFonts w:ascii="Arial" w:hAnsi="Arial"/>
+          <w:sz w:val="21"/>
         </w:rPr>
         <w:t>&gt;</w:t>
       </w:r>
@@ -1197,26 +1208,20 @@
       </w:pPr>
       <w:r>
         <w:rPr>
+          <w:rFonts w:ascii="Arial" w:hAnsi="Arial"/>
           <w:i/>
           <w:color w:val="1E293B"/>
           <w:sz w:val="22"/>
         </w:rPr>
-        <w:t>Nhóm em xin lưu ý: biểu đồ này chỉ mang tính mô tả trên mẫu dữ liệu thu thập được từ ITviec, nhóm không xem đây là thước đo xếp hạng doanh nghiệp ngoài đời thực ạ."</w:t>
+        <w:t>Nhóm em xin lưu ý: biểu đồ này chỉ mang tính mô tả trên mẫu dữ liệu thu thập được từ ITviec, nhóm không xem đây là thước đo xếp hạng doanh nghiệp ngoài đời thực"</w:t>
       </w:r>
     </w:p>
     <w:p>
       <w:r>
         <w:rPr>
-          <w:color w:val="C8C8C8"/>
-        </w:rPr>
-        <w:t>____________________________________________________</w:t>
-      </w:r>
-    </w:p>
-    <w:p>
-      <w:r>
-        <w:rPr>
+          <w:rFonts w:ascii="Arial" w:hAnsi="Arial"/>
           <w:b/>
-          <w:color w:val="0066CC"/>
+          <w:color w:val="2966C4"/>
           <w:sz w:val="26"/>
         </w:rPr>
         <w:t>Slide 12 — Minh họa đặc trưng TF-IDF</w:t>
@@ -1225,9 +1230,10 @@
     <w:p>
       <w:r>
         <w:rPr>
-          <w:sz w:val="22"/>
+          <w:rFonts w:ascii="Arial" w:hAnsi="Arial"/>
+          <w:sz w:val="21"/>
         </w:rPr>
-        <w:t>**Thời lượng:** 35 giây *(Mốc: 7:00)*</w:t>
+        <w:t>Thời lượng: 35 giây (Mốc: 7:00)</w:t>
       </w:r>
     </w:p>
     <w:p>
@@ -1236,17 +1242,19 @@
       </w:pPr>
       <w:r>
         <w:rPr>
+          <w:rFonts w:ascii="Arial" w:hAnsi="Arial"/>
           <w:i/>
           <w:color w:val="1E293B"/>
           <w:sz w:val="22"/>
         </w:rPr>
-        <w:t>"Trên màn hình là ví dụ câu review: *'Lương thấp, quản lý thiếu minh bạch và thường xuyên phải OT không lương'*. Bản sửa mới nhất nhận diện chính xác nhãn Tiêu cực với xác suất lên tới **99,0%**.</w:t>
+        <w:t>"Trên màn hình là ví dụ câu review: 'Lương thấp, quản lý thiếu minh bạch và thường xuyên phải OT không lương'. Bản sửa mới nhất nhận diện chính xác nhãn Tiêu cực với độ tin cậy lên tới 99,0%.</w:t>
       </w:r>
     </w:p>
     <w:p>
       <w:r>
         <w:rPr>
-          <w:sz w:val="22"/>
+          <w:rFonts w:ascii="Arial" w:hAnsi="Arial"/>
+          <w:sz w:val="21"/>
         </w:rPr>
         <w:t>&gt;</w:t>
       </w:r>
@@ -1257,26 +1265,20 @@
       </w:pPr>
       <w:r>
         <w:rPr>
+          <w:rFonts w:ascii="Arial" w:hAnsi="Arial"/>
           <w:i/>
           <w:color w:val="1E293B"/>
           <w:sz w:val="22"/>
         </w:rPr>
-        <w:t>Biểu đồ bên cạnh thể hiện các đặc trưng có trọng số TF-IDF nổi bật nhất: cụm *'thường_xuyên ot'*, *'minh_bạch'*, *'thiếu'* và *'không lương'*. Trục biểu đồ nhân 100 để dễ quan sát độ lớn của từ đầu vào, chứ không phải xác suất của lớp. Điều này minh chứng cho thấy bộ tiền xử lý và Bigram của nhóm đang hoạt động đúng như mong đợi."</w:t>
+        <w:t>Biểu đồ bên cạnh thể hiện các đặc trưng có trọng số TF-IDF nổi bật nhất: cụm 'thường_xuyên ot', 'minh_bạch', 'thiếu' và 'không lương'. Trục biểu đồ nhân 100 để dễ quan sát độ lớn của từ đầu vào, chứ không phải xác suất của lớp. Điều này minh chứng cho thấy bộ tiền xử lý và Bigram của nhóm đang hoạt động đúng như mong đợi."</w:t>
       </w:r>
     </w:p>
     <w:p>
       <w:r>
         <w:rPr>
-          <w:color w:val="C8C8C8"/>
-        </w:rPr>
-        <w:t>____________________________________________________</w:t>
-      </w:r>
-    </w:p>
-    <w:p>
-      <w:r>
-        <w:rPr>
+          <w:rFonts w:ascii="Arial" w:hAnsi="Arial"/>
           <w:b/>
-          <w:color w:val="0066CC"/>
+          <w:color w:val="2966C4"/>
           <w:sz w:val="26"/>
         </w:rPr>
         <w:t>Slide 13 — Đánh giá và hạn chế</w:t>
@@ -1285,9 +1287,10 @@
     <w:p>
       <w:r>
         <w:rPr>
-          <w:sz w:val="22"/>
+          <w:rFonts w:ascii="Arial" w:hAnsi="Arial"/>
+          <w:sz w:val="21"/>
         </w:rPr>
-        <w:t>**Thời lượng:** 35 giây *(Mốc: 7:35)*</w:t>
+        <w:t>Thời lượng: 35 giây (Mốc: 7:35)</w:t>
       </w:r>
     </w:p>
     <w:p>
@@ -1296,17 +1299,19 @@
       </w:pPr>
       <w:r>
         <w:rPr>
+          <w:rFonts w:ascii="Arial" w:hAnsi="Arial"/>
           <w:i/>
           <w:color w:val="1E293B"/>
           <w:sz w:val="22"/>
         </w:rPr>
-        <w:t>"Qua đồ án môn học này, nhóm sinh viên năm nhất chúng em đã tự tay xây dựng trọn vẹn một pipeline học máy hoàn chỉnh từ dữ liệu thô đến mô hình hóa và triển khai giao diện.</w:t>
+        <w:t>"Qua đồ án môn học này, nhóm em đã tự tay xây dựng trọn vẹn một pipeline học máy hoàn chỉnh từ dữ liệu thô đến mô hình hóa và triển khai giao diện.</w:t>
       </w:r>
     </w:p>
     <w:p>
       <w:r>
         <w:rPr>
-          <w:sz w:val="22"/>
+          <w:rFonts w:ascii="Arial" w:hAnsi="Arial"/>
+          <w:sz w:val="21"/>
         </w:rPr>
         <w:t>&gt;</w:t>
       </w:r>
@@ -1317,6 +1322,7 @@
       </w:pPr>
       <w:r>
         <w:rPr>
+          <w:rFonts w:ascii="Arial" w:hAnsi="Arial"/>
           <w:i/>
           <w:color w:val="1E293B"/>
           <w:sz w:val="22"/>
@@ -1325,74 +1331,10 @@
       </w:r>
     </w:p>
     <w:p>
-      <w:pPr>
-        <w:ind w:left="432"/>
-      </w:pPr>
       <w:r>
         <w:rPr>
-          <w:i/>
-          <w:color w:val="1E293B"/>
-          <w:sz w:val="22"/>
-        </w:rPr>
-        <w:t>1. **Vấn đề nhãn yếu**: Số sao không phản ánh 100% ngữ nghĩa của bài viết.</w:t>
-      </w:r>
-    </w:p>
-    <w:p>
-      <w:pPr>
-        <w:ind w:left="432"/>
-      </w:pPr>
-      <w:r>
-        <w:rPr>
-          <w:i/>
-          <w:color w:val="1E293B"/>
-          <w:sz w:val="22"/>
-        </w:rPr>
-        <w:t>2. **Hạn chế của mô hình truyền thống**: TF-IDF kết hợp Logistic Regression chưa nắm bắt được ngữ cảnh ngữ nghĩa sâu, các câu đảo ngữ hay câu dài nhiều vế."</w:t>
-      </w:r>
-    </w:p>
-    <w:p>
-      <w:r>
-        <w:rPr>
-          <w:color w:val="C8C8C8"/>
-        </w:rPr>
-        <w:t>____________________________________________________</w:t>
-      </w:r>
-    </w:p>
-    <w:p>
-      <w:r>
-        <w:rPr>
-          <w:b/>
-          <w:color w:val="0066CC"/>
-          <w:sz w:val="26"/>
-        </w:rPr>
-        <w:t>Slide 14 — Kết luận &amp; Hướng phát triển</w:t>
-      </w:r>
-    </w:p>
-    <w:p>
-      <w:r>
-        <w:rPr>
-          <w:sz w:val="22"/>
-        </w:rPr>
-        <w:t>**Thời lượng:** 30 giây *(Mốc: 8:05)*</w:t>
-      </w:r>
-    </w:p>
-    <w:p>
-      <w:pPr>
-        <w:ind w:left="432"/>
-      </w:pPr>
-      <w:r>
-        <w:rPr>
-          <w:i/>
-          <w:color w:val="1E293B"/>
-          <w:sz w:val="22"/>
-        </w:rPr>
-        <w:t>"Tóm lại, đồ án đã mang lại cho nhóm em những trải nghiệm thực tế quý báu về xử lý văn bản tiếng Việt và tư duy thực nghiệm cẩn trọng trong Machine Learning.</w:t>
-      </w:r>
-    </w:p>
-    <w:p>
-      <w:r>
-        <w:rPr>
-          <w:sz w:val="22"/>
+          <w:rFonts w:ascii="Arial" w:hAnsi="Arial"/>
+          <w:sz w:val="21"/>
         </w:rPr>
         <w:t>&gt;</w:t>
       </w:r>
@@ -1403,6 +1345,78 @@
       </w:pPr>
       <w:r>
         <w:rPr>
+          <w:rFonts w:ascii="Arial" w:hAnsi="Arial"/>
+          <w:i/>
+          <w:color w:val="1E293B"/>
+          <w:sz w:val="22"/>
+        </w:rPr>
+        <w:t>1. Vấn đề nhãn yếu: Số sao không phản ánh 100% ngữ nghĩa của bài viết.</w:t>
+      </w:r>
+    </w:p>
+    <w:p>
+      <w:pPr>
+        <w:ind w:left="432"/>
+      </w:pPr>
+      <w:r>
+        <w:rPr>
+          <w:rFonts w:ascii="Arial" w:hAnsi="Arial"/>
+          <w:i/>
+          <w:color w:val="1E293B"/>
+          <w:sz w:val="22"/>
+        </w:rPr>
+        <w:t>2. Hạn chế của mô hình truyền thống: TF-IDF kết hợp Logistic Regression chưa nắm bắt được ngữ cảnh ngữ nghĩa sâu, các câu đảo ngữ hay câu dài nhiều vế."</w:t>
+      </w:r>
+    </w:p>
+    <w:p>
+      <w:r>
+        <w:rPr>
+          <w:rFonts w:ascii="Arial" w:hAnsi="Arial"/>
+          <w:b/>
+          <w:color w:val="2966C4"/>
+          <w:sz w:val="26"/>
+        </w:rPr>
+        <w:t>Slide 14 — Kết luận &amp; Hướng phát triển</w:t>
+      </w:r>
+    </w:p>
+    <w:p>
+      <w:r>
+        <w:rPr>
+          <w:rFonts w:ascii="Arial" w:hAnsi="Arial"/>
+          <w:sz w:val="21"/>
+        </w:rPr>
+        <w:t>Thời lượng: 30 giây (Mốc: 8:05)</w:t>
+      </w:r>
+    </w:p>
+    <w:p>
+      <w:pPr>
+        <w:ind w:left="432"/>
+      </w:pPr>
+      <w:r>
+        <w:rPr>
+          <w:rFonts w:ascii="Arial" w:hAnsi="Arial"/>
+          <w:i/>
+          <w:color w:val="1E293B"/>
+          <w:sz w:val="22"/>
+        </w:rPr>
+        <w:t>"Tóm lại, đồ án đã mang lại cho nhóm em những trải nghiệm thực tế về xử lý văn bản tiếng Việt và tư duy thực nghiệm trong Machine Learning.</w:t>
+      </w:r>
+    </w:p>
+    <w:p>
+      <w:r>
+        <w:rPr>
+          <w:rFonts w:ascii="Arial" w:hAnsi="Arial"/>
+          <w:sz w:val="21"/>
+        </w:rPr>
+        <w:t>&gt;</w:t>
+      </w:r>
+    </w:p>
+    <w:p>
+      <w:pPr>
+        <w:ind w:left="432"/>
+      </w:pPr>
+      <w:r>
+        <w:rPr>
+          <w:rFonts w:ascii="Arial" w:hAnsi="Arial"/>
           <w:i/>
           <w:color w:val="1E293B"/>
           <w:sz w:val="22"/>
@@ -1411,11 +1425,21 @@
       </w:r>
     </w:p>
     <w:p>
+      <w:r>
+        <w:rPr>
+          <w:rFonts w:ascii="Arial" w:hAnsi="Arial"/>
+          <w:sz w:val="21"/>
+        </w:rPr>
+        <w:t>&gt;</w:t>
+      </w:r>
+    </w:p>
+    <w:p>
       <w:pPr>
         <w:ind w:left="432"/>
       </w:pPr>
       <w:r>
         <w:rPr>
+          <w:rFonts w:ascii="Arial" w:hAnsi="Arial"/>
           <w:i/>
           <w:color w:val="1E293B"/>
           <w:sz w:val="22"/>
@@ -1429,6 +1453,7 @@
       </w:pPr>
       <w:r>
         <w:rPr>
+          <w:rFonts w:ascii="Arial" w:hAnsi="Arial"/>
           <w:i/>
           <w:color w:val="1E293B"/>
           <w:sz w:val="22"/>
@@ -1442,6 +1467,7 @@
       </w:pPr>
       <w:r>
         <w:rPr>
+          <w:rFonts w:ascii="Arial" w:hAnsi="Arial"/>
           <w:i/>
           <w:color w:val="1E293B"/>
           <w:sz w:val="22"/>
@@ -1452,7 +1478,8 @@
     <w:p>
       <w:r>
         <w:rPr>
-          <w:sz w:val="22"/>
+          <w:rFonts w:ascii="Arial" w:hAnsi="Arial"/>
+          <w:sz w:val="21"/>
         </w:rPr>
         <w:t>&gt;</w:t>
       </w:r>
@@ -1463,26 +1490,20 @@
       </w:pPr>
       <w:r>
         <w:rPr>
+          <w:rFonts w:ascii="Arial" w:hAnsi="Arial"/>
           <w:i/>
           <w:color w:val="1E293B"/>
           <w:sz w:val="22"/>
         </w:rPr>
-        <w:t>Phần trình bày slide của em xin được tạm dừng tại đây. Tiếp theo, em xin trân trọng kính mời bạn **Nguyễn Duy Khang** đại diện nhóm tiến hành phần Live Demo ứng dụng ạ!"</w:t>
+        <w:t>Phần trình bày slide của em xin được tạm dừng tại đây. Tiếp theo, em xin bạn Nguyễn Duy Khang đại diện nhóm tiến hành phần Live Demo ứng dụng ạ!"</w:t>
       </w:r>
     </w:p>
     <w:p>
       <w:r>
         <w:rPr>
-          <w:color w:val="C8C8C8"/>
-        </w:rPr>
-        <w:t>____________________________________________________</w:t>
-      </w:r>
-    </w:p>
-    <w:p>
-      <w:r>
-        <w:rPr>
+          <w:rFonts w:ascii="Arial" w:hAnsi="Arial"/>
           <w:b/>
-          <w:color w:val="0066CC"/>
+          <w:color w:val="2966C4"/>
           <w:sz w:val="26"/>
         </w:rPr>
         <w:t>Slide 15 — Dẫn vào Live Demo</w:t>
@@ -1491,9 +1512,10 @@
     <w:p>
       <w:r>
         <w:rPr>
-          <w:sz w:val="22"/>
+          <w:rFonts w:ascii="Arial" w:hAnsi="Arial"/>
+          <w:sz w:val="21"/>
         </w:rPr>
-        <w:t>**Thời lượng:** 25 giây *(Mốc: 8:30)*</w:t>
+        <w:t>Thời lượng: 25 giây (Mốc: 8:30)</w:t>
       </w:r>
     </w:p>
     <w:p>
@@ -1502,11 +1524,12 @@
       </w:pPr>
       <w:r>
         <w:rPr>
+          <w:rFonts w:ascii="Arial" w:hAnsi="Arial"/>
           <w:i/>
           <w:color w:val="1E293B"/>
           <w:sz w:val="22"/>
         </w:rPr>
-        <w:t>*(Duy Khang bước lên/bật mic):*</w:t>
+        <w:t>(Duy Khang bước lên/bật mic):</w:t>
       </w:r>
     </w:p>
     <w:p>
@@ -1515,6 +1538,7 @@
       </w:pPr>
       <w:r>
         <w:rPr>
+          <w:rFonts w:ascii="Arial" w:hAnsi="Arial"/>
           <w:i/>
           <w:color w:val="1E293B"/>
           <w:sz w:val="22"/>
@@ -1523,18 +1547,14 @@
       </w:r>
     </w:p>
     <w:p>
+      <w:pPr>
+        <w:jc w:val="center"/>
+      </w:pPr>
       <w:r>
         <w:rPr>
-          <w:color w:val="C8C8C8"/>
-        </w:rPr>
-        <w:t>____________________________________________________</w:t>
-      </w:r>
-    </w:p>
-    <w:p>
-      <w:r>
-        <w:rPr>
+          <w:rFonts w:ascii="Arial" w:hAnsi="Arial"/>
           <w:b/>
-          <w:color w:val="0054A6"/>
+          <w:color w:val="102C57"/>
           <w:sz w:val="40"/>
         </w:rPr>
         <w:t>PHẦN B — KỊCH BẢN LIVE DEMO (3:30)</w:t>
@@ -1543,24 +1563,18 @@
     <w:p>
       <w:r>
         <w:rPr>
-          <w:sz w:val="22"/>
+          <w:rFonts w:ascii="Arial" w:hAnsi="Arial"/>
+          <w:sz w:val="21"/>
         </w:rPr>
-        <w:t>*(Người thao tác &amp; thuyết minh: Nguyễn Duy Khang)*</w:t>
+        <w:t>(Người thao tác &amp; thuyết minh: Nguyễn Duy Khang)</w:t>
       </w:r>
     </w:p>
     <w:p>
       <w:r>
         <w:rPr>
-          <w:color w:val="C8C8C8"/>
-        </w:rPr>
-        <w:t>____________________________________________________</w:t>
-      </w:r>
-    </w:p>
-    <w:p>
-      <w:r>
-        <w:rPr>
+          <w:rFonts w:ascii="Arial" w:hAnsi="Arial"/>
           <w:b/>
-          <w:color w:val="0066CC"/>
+          <w:color w:val="2966C4"/>
           <w:sz w:val="26"/>
         </w:rPr>
         <w:t>Bước 1: Insight doanh nghiệp (45 giây)</w:t>
@@ -1569,33 +1583,46 @@
     <w:p>
       <w:r>
         <w:rPr>
-          <w:sz w:val="22"/>
+          <w:rFonts w:ascii="Arial" w:hAnsi="Arial"/>
+          <w:sz w:val="21"/>
         </w:rPr>
-        <w:t>**Thao tác:** Bấm tab **Insight doanh nghiệp** ở menu bên trái.</w:t>
+        <w:t>Thao tác: Bấm tab Insight doanh nghiệp ở menu bên trái.</w:t>
       </w:r>
     </w:p>
     <w:p>
+      <w:pPr>
+        <w:pStyle w:val="ListBullet"/>
+      </w:pPr>
       <w:r>
         <w:rPr>
-          <w:sz w:val="22"/>
+          <w:rFonts w:ascii="Arial" w:hAnsi="Arial"/>
+          <w:sz w:val="21"/>
         </w:rPr>
-        <w:t>* Chọn công ty **FPT Software** (công ty có nhiều mẫu nhất — 2.014 review).</w:t>
+        <w:t>Chọn công ty FPT Software (công ty có nhiều mẫu nhất — 2.014 review).</w:t>
       </w:r>
     </w:p>
     <w:p>
+      <w:pPr>
+        <w:pStyle w:val="ListBullet"/>
+      </w:pPr>
       <w:r>
         <w:rPr>
-          <w:sz w:val="22"/>
+          <w:rFonts w:ascii="Arial" w:hAnsi="Arial"/>
+          <w:sz w:val="21"/>
         </w:rPr>
-        <w:t>* Chỉ nhanh vào biểu đồ tròn Donut (Tích cực 57,7%) và biểu đồ 5 khía cạnh.</w:t>
+        <w:t>Chỉ nhanh vào biểu đồ tròn Donut (Tích cực 57,7%) và biểu đồ 5 khía cạnh.</w:t>
       </w:r>
     </w:p>
     <w:p>
+      <w:pPr>
+        <w:pStyle w:val="ListBullet"/>
+      </w:pPr>
       <w:r>
         <w:rPr>
-          <w:sz w:val="22"/>
+          <w:rFonts w:ascii="Arial" w:hAnsi="Arial"/>
+          <w:sz w:val="21"/>
         </w:rPr>
-        <w:t>* Cuộn xuống WordCloud: Bấm sang **Tích cực** để thấy các từ khóa khen ngợi, sau đó bấm lại **Tiêu cực** và chỉ vào các từ như *'ot'*, *'lương'*, *'dự_án'*.</w:t>
+        <w:t>Cuộn xuống WordCloud: Bấm sang Tích cực để thấy các từ khóa khen ngợi, sau đó bấm lại Tiêu cực và chỉ vào các từ như 'ot', 'lương', 'dự_án'.</w:t>
       </w:r>
     </w:p>
     <w:p>
@@ -1604,11 +1631,12 @@
       </w:pPr>
       <w:r>
         <w:rPr>
+          <w:rFonts w:ascii="Arial" w:hAnsi="Arial"/>
           <w:i/>
           <w:color w:val="1E293B"/>
           <w:sz w:val="22"/>
         </w:rPr>
-        <w:t>**Lời nói:**</w:t>
+        <w:t>Lời nói:</w:t>
       </w:r>
     </w:p>
     <w:p>
@@ -1617,6 +1645,7 @@
       </w:pPr>
       <w:r>
         <w:rPr>
+          <w:rFonts w:ascii="Arial" w:hAnsi="Arial"/>
           <w:i/>
           <w:color w:val="1E293B"/>
           <w:sz w:val="22"/>
@@ -1627,16 +1656,9 @@
     <w:p>
       <w:r>
         <w:rPr>
-          <w:color w:val="C8C8C8"/>
-        </w:rPr>
-        <w:t>____________________________________________________</w:t>
-      </w:r>
-    </w:p>
-    <w:p>
-      <w:r>
-        <w:rPr>
+          <w:rFonts w:ascii="Arial" w:hAnsi="Arial"/>
           <w:b/>
-          <w:color w:val="0066CC"/>
+          <w:color w:val="2966C4"/>
           <w:sz w:val="26"/>
         </w:rPr>
         <w:t>Bước 2: Mô hình &amp; Đánh giá (50 giây)</w:t>
@@ -1645,33 +1667,46 @@
     <w:p>
       <w:r>
         <w:rPr>
-          <w:sz w:val="22"/>
+          <w:rFonts w:ascii="Arial" w:hAnsi="Arial"/>
+          <w:sz w:val="21"/>
         </w:rPr>
-        <w:t>**Thao tác:** Bấm tab **Mô hình &amp; đánh giá** ở menu bên trái.</w:t>
+        <w:t>Thao tác: Bấm tab Mô hình &amp; đánh giá ở menu bên trái.</w:t>
       </w:r>
     </w:p>
     <w:p>
+      <w:pPr>
+        <w:pStyle w:val="ListBullet"/>
+      </w:pPr>
       <w:r>
         <w:rPr>
-          <w:sz w:val="22"/>
+          <w:rFonts w:ascii="Arial" w:hAnsi="Arial"/>
+          <w:sz w:val="21"/>
         </w:rPr>
-        <w:t>* Chỉ nhanh vào biểu đồ So sánh 5 mô hình ban đầu (Logistic Regression dẫn đầu ~0.572).</w:t>
+        <w:t>Chỉ nhanh vào biểu đồ So sánh 5 mô hình ban đầu (Logistic Regression dẫn đầu ~0.572).</w:t>
       </w:r>
     </w:p>
     <w:p>
+      <w:pPr>
+        <w:pStyle w:val="ListBullet"/>
+      </w:pPr>
       <w:r>
         <w:rPr>
-          <w:sz w:val="22"/>
+          <w:rFonts w:ascii="Arial" w:hAnsi="Arial"/>
+          <w:sz w:val="21"/>
         </w:rPr>
-        <w:t>* Cuộn xuống Ma trận nhầm lẫn: chỉ vào hàng Tiêu cực (tìm đúng 52/114 mẫu).</w:t>
+        <w:t>Cuộn xuống Ma trận nhầm lẫn: chỉ vào hàng Tiêu cực (tìm đúng 52/114 mẫu).</w:t>
       </w:r>
     </w:p>
     <w:p>
+      <w:pPr>
+        <w:pStyle w:val="ListBullet"/>
+      </w:pPr>
       <w:r>
         <w:rPr>
-          <w:sz w:val="22"/>
+          <w:rFonts w:ascii="Arial" w:hAnsi="Arial"/>
+          <w:sz w:val="21"/>
         </w:rPr>
-        <w:t>* Cuộn xuống khung **Khám phá 15 lỗi minh họa**: Lọc nhãn thật **Negative**, bấm chọn review `#2592`.</w:t>
+        <w:t>Cuộn xuống khung Khám phá 15 lỗi minh họa: Lọc nhãn thật Negative, bấm chọn review `#2592`.</w:t>
       </w:r>
     </w:p>
     <w:p>
@@ -1680,11 +1715,12 @@
       </w:pPr>
       <w:r>
         <w:rPr>
+          <w:rFonts w:ascii="Arial" w:hAnsi="Arial"/>
           <w:i/>
           <w:color w:val="1E293B"/>
           <w:sz w:val="22"/>
         </w:rPr>
-        <w:t>**Lời nói:**</w:t>
+        <w:t>Lời nói:</w:t>
       </w:r>
     </w:p>
     <w:p>
@@ -1693,6 +1729,7 @@
       </w:pPr>
       <w:r>
         <w:rPr>
+          <w:rFonts w:ascii="Arial" w:hAnsi="Arial"/>
           <w:i/>
           <w:color w:val="1E293B"/>
           <w:sz w:val="22"/>
@@ -1706,6 +1743,7 @@
       </w:pPr>
       <w:r>
         <w:rPr>
+          <w:rFonts w:ascii="Arial" w:hAnsi="Arial"/>
           <w:i/>
           <w:color w:val="1E293B"/>
           <w:sz w:val="22"/>
@@ -1716,16 +1754,9 @@
     <w:p>
       <w:r>
         <w:rPr>
-          <w:color w:val="C8C8C8"/>
-        </w:rPr>
-        <w:t>____________________________________________________</w:t>
-      </w:r>
-    </w:p>
-    <w:p>
-      <w:r>
-        <w:rPr>
+          <w:rFonts w:ascii="Arial" w:hAnsi="Arial"/>
           <w:b/>
-          <w:color w:val="0066CC"/>
+          <w:color w:val="2966C4"/>
           <w:sz w:val="26"/>
         </w:rPr>
         <w:t>Bước 3: Phân tích review theo thời gian thực (1 phút 20 giây)</w:t>
@@ -1734,41 +1765,58 @@
     <w:p>
       <w:r>
         <w:rPr>
-          <w:sz w:val="22"/>
+          <w:rFonts w:ascii="Arial" w:hAnsi="Arial"/>
+          <w:sz w:val="21"/>
         </w:rPr>
-        <w:t>**Thao tác:** Bấm tab **Phân tích review** ở menu bên trái.</w:t>
+        <w:t>Thao tác: Bấm tab Phân tích review ở menu bên trái.</w:t>
       </w:r>
     </w:p>
     <w:p>
+      <w:pPr>
+        <w:pStyle w:val="ListBullet"/>
+      </w:pPr>
       <w:r>
         <w:rPr>
-          <w:sz w:val="22"/>
+          <w:rFonts w:ascii="Arial" w:hAnsi="Arial"/>
+          <w:sz w:val="21"/>
         </w:rPr>
-        <w:t>* Bấm tình huống mẫu **Nhiều vế** *(“Môi trường tốt nhưng lương thấp và quản lý chưa thật sự quan tâm nhân viên”)* $\rightarrow$ Ứng dụng tự động phân tích ngay lập tức.</w:t>
+        <w:t>Bấm tình huống mẫu Nhiều vế (“Môi trường tốt nhưng lương thấp và quản lý chưa thật sự quan tâm nhân viên”) $\rightarrow$ Ứng dụng tự động phân tích ngay lập tức.</w:t>
       </w:r>
     </w:p>
     <w:p>
+      <w:pPr>
+        <w:pStyle w:val="ListBullet"/>
+      </w:pPr>
       <w:r>
         <w:rPr>
-          <w:sz w:val="22"/>
+          <w:rFonts w:ascii="Arial" w:hAnsi="Arial"/>
+          <w:sz w:val="21"/>
         </w:rPr>
-        <w:t>* Đọc kết quả bên phải: Nhãn **Trung tính (58,7%)**, chỉ vào 3 thanh xác suất (Tiêu cực vẫn chiếm 30,0%).</w:t>
+        <w:t>Đọc kết quả bên phải: Nhãn Trung tính (58,7%), chỉ vào 3 thanh xác suất (Tiêu cực vẫn chiếm 30,0%).</w:t>
       </w:r>
     </w:p>
     <w:p>
+      <w:pPr>
+        <w:pStyle w:val="ListBullet"/>
+      </w:pPr>
       <w:r>
         <w:rPr>
-          <w:sz w:val="22"/>
+          <w:rFonts w:ascii="Arial" w:hAnsi="Arial"/>
+          <w:sz w:val="21"/>
         </w:rPr>
-        <w:t>* Cuộn xuống khung văn bản sau chuẩn hóa: chỉ từ *'môi_trường'*, *'lương thấp'* và bảng Token TF-IDF nổi bật.</w:t>
+        <w:t>Cuộn xuống khung văn bản sau chuẩn hóa: chỉ từ 'môi_trường', 'lương thấp' và bảng Token TF-IDF nổi bật.</w:t>
       </w:r>
     </w:p>
     <w:p>
+      <w:pPr>
+        <w:pStyle w:val="ListBullet"/>
+      </w:pPr>
       <w:r>
         <w:rPr>
-          <w:sz w:val="22"/>
+          <w:rFonts w:ascii="Arial" w:hAnsi="Arial"/>
+          <w:sz w:val="21"/>
         </w:rPr>
-        <w:t>* *(Nếu còn thời gian)*: Bấm thêm mẫu **Tiêu cực** *(“Lương thấp, quản lý thiếu minh bạch…”)* để Thầy thấy mô hình bắt đúng 99,0% nhãn Tiêu cực.</w:t>
+        <w:t>(Nếu còn thời gian): Bấm thêm mẫu Tiêu cực (“Lương thấp, quản lý thiếu minh bạch…”) để Thầy thấy mô hình bắt đúng 99,0% nhãn Tiêu cực.</w:t>
       </w:r>
     </w:p>
     <w:p>
@@ -1777,11 +1825,12 @@
       </w:pPr>
       <w:r>
         <w:rPr>
+          <w:rFonts w:ascii="Arial" w:hAnsi="Arial"/>
           <w:i/>
           <w:color w:val="1E293B"/>
           <w:sz w:val="22"/>
         </w:rPr>
-        <w:t>**Lời nói:**</w:t>
+        <w:t>Lời nói:</w:t>
       </w:r>
     </w:p>
     <w:p>
@@ -1790,11 +1839,12 @@
       </w:pPr>
       <w:r>
         <w:rPr>
+          <w:rFonts w:ascii="Arial" w:hAnsi="Arial"/>
           <w:i/>
           <w:color w:val="1E293B"/>
           <w:sz w:val="22"/>
         </w:rPr>
-        <w:t>"Bây giờ em xin thử nghiệm phân tích một review thực tế. Khi em bấm mẫu tình huống 'Nhiều vế', hệ thống tự động xử lý ngay lập tức: kết quả dự đoán là **Trung tính 58,7%**, nhưng thanh Tiêu cực vẫn chiếm tới 30,0%.</w:t>
+        <w:t>"Bây giờ em xin thử nghiệm phân tích một review thực tế. Khi em bấm mẫu tình huống 'Nhiều vế', hệ thống tự động xử lý ngay lập tức: kết quả dự đoán là Trung tính 58,7%, nhưng thanh Tiêu cực vẫn chiếm tới 30,0%.</w:t>
       </w:r>
     </w:p>
     <w:p>
@@ -1803,6 +1853,7 @@
       </w:pPr>
       <w:r>
         <w:rPr>
+          <w:rFonts w:ascii="Arial" w:hAnsi="Arial"/>
           <w:i/>
           <w:color w:val="1E293B"/>
           <w:sz w:val="22"/>
@@ -1816,26 +1867,20 @@
       </w:pPr>
       <w:r>
         <w:rPr>
+          <w:rFonts w:ascii="Arial" w:hAnsi="Arial"/>
           <w:i/>
           <w:color w:val="1E293B"/>
           <w:sz w:val="22"/>
         </w:rPr>
-        <w:t>*(Tùy chọn)*: Nếu thử câu hoàn toàn tiêu cực về OT không lương, mô hình nhận diện chính xác 99,0% lớp Tiêu cực ạ."</w:t>
+        <w:t>(Tùy chọn): Nếu thử câu hoàn toàn tiêu cực về OT không lương, mô hình nhận diện chính xác 99,0% lớp Tiêu cực ạ."</w:t>
       </w:r>
     </w:p>
     <w:p>
       <w:r>
         <w:rPr>
-          <w:color w:val="C8C8C8"/>
-        </w:rPr>
-        <w:t>____________________________________________________</w:t>
-      </w:r>
-    </w:p>
-    <w:p>
-      <w:r>
-        <w:rPr>
+          <w:rFonts w:ascii="Arial" w:hAnsi="Arial"/>
           <w:b/>
-          <w:color w:val="0066CC"/>
+          <w:color w:val="2966C4"/>
           <w:sz w:val="26"/>
         </w:rPr>
         <w:t>Bước 4: Kết thúc và mở phần Q&amp;A (35 giây)</w:t>
@@ -1844,9 +1889,10 @@
     <w:p>
       <w:r>
         <w:rPr>
-          <w:sz w:val="22"/>
+          <w:rFonts w:ascii="Arial" w:hAnsi="Arial"/>
+          <w:sz w:val="21"/>
         </w:rPr>
-        <w:t>**Thao tác:** Giữ nguyên màn hình web app ở trang Phân tích review, hướng mắt về Thầy và Hội đồng.</w:t>
+        <w:t>Thao tác: Giữ nguyên màn hình web app ở trang Phân tích review, hướng mắt về Thầy và Hội đồng.</w:t>
       </w:r>
     </w:p>
     <w:p>
@@ -1855,11 +1901,12 @@
       </w:pPr>
       <w:r>
         <w:rPr>
+          <w:rFonts w:ascii="Arial" w:hAnsi="Arial"/>
           <w:i/>
           <w:color w:val="1E293B"/>
           <w:sz w:val="22"/>
         </w:rPr>
-        <w:t>**Lời nói:**</w:t>
+        <w:t>Lời nói:</w:t>
       </w:r>
     </w:p>
     <w:p>
@@ -1868,6 +1915,7 @@
       </w:pPr>
       <w:r>
         <w:rPr>
+          <w:rFonts w:ascii="Arial" w:hAnsi="Arial"/>
           <w:i/>
           <w:color w:val="1E293B"/>
           <w:sz w:val="22"/>
@@ -1878,7 +1926,8 @@
     <w:p>
       <w:r>
         <w:rPr>
-          <w:sz w:val="22"/>
+          <w:rFonts w:ascii="Arial" w:hAnsi="Arial"/>
+          <w:sz w:val="21"/>
         </w:rPr>
         <w:t>&gt;</w:t>
       </w:r>
@@ -1889,6 +1938,7 @@
       </w:pPr>
       <w:r>
         <w:rPr>
+          <w:rFonts w:ascii="Arial" w:hAnsi="Arial"/>
           <w:i/>
           <w:color w:val="1E293B"/>
           <w:sz w:val="22"/>

</xml_diff>